<commit_message>
Précision défausse au Cimetière pour construire un Donjon ; fin traduction en anglais des cartes
</commit_message>
<xml_diff>
--- a/pictures/Deck-fr/All-cards-fr.docx
+++ b/pictures/Deck-fr/All-cards-fr.docx
@@ -44,6 +44,9 @@
               <w:jc w:val="center"/>
             </w:pPr>
             <w:r>
+              <w:rPr>
+                <w:noProof/>
+              </w:rPr>
               <w:drawing>
                 <wp:inline distT="0" distB="0" distL="0" distR="0" wp14:anchorId="0E7D2F7F" wp14:editId="7393CFBC">
                   <wp:extent cx="3387600" cy="2340000"/>
@@ -503,10 +506,10 @@
                 <w:noProof/>
               </w:rPr>
               <w:drawing>
-                <wp:inline distT="0" distB="0" distL="0" distR="0" wp14:anchorId="1801EFF2" wp14:editId="4D630501">
-                  <wp:extent cx="1501200" cy="2340000"/>
-                  <wp:effectExtent l="0" t="0" r="3810" b="3175"/>
-                  <wp:docPr id="1315331431" name="Image 8"/>
+                <wp:inline distT="0" distB="0" distL="0" distR="0" wp14:anchorId="0B08CFF3" wp14:editId="6C1E4417">
+                  <wp:extent cx="1505030" cy="2340000"/>
+                  <wp:effectExtent l="0" t="0" r="0" b="3175"/>
+                  <wp:docPr id="899923425" name="Image 1"/>
                   <wp:cNvGraphicFramePr>
                     <a:graphicFrameLocks xmlns:a="http://schemas.openxmlformats.org/drawingml/2006/main" noChangeAspect="1"/>
                   </wp:cNvGraphicFramePr>
@@ -514,7 +517,7 @@
                     <a:graphicData uri="http://schemas.openxmlformats.org/drawingml/2006/picture">
                       <pic:pic xmlns:pic="http://schemas.openxmlformats.org/drawingml/2006/picture">
                         <pic:nvPicPr>
-                          <pic:cNvPr id="0" name="Picture 14"/>
+                          <pic:cNvPr id="0" name="Picture 1"/>
                           <pic:cNvPicPr>
                             <a:picLocks noChangeAspect="1" noChangeArrowheads="1"/>
                           </pic:cNvPicPr>
@@ -535,7 +538,7 @@
                         <pic:spPr bwMode="auto">
                           <a:xfrm>
                             <a:off x="0" y="0"/>
-                            <a:ext cx="1501200" cy="2340000"/>
+                            <a:ext cx="1505030" cy="2340000"/>
                           </a:xfrm>
                           <a:prstGeom prst="rect">
                             <a:avLst/>

</xml_diff>

<commit_message>
First English translation ; mise en cohérence de la règle française
</commit_message>
<xml_diff>
--- a/pictures/Deck-fr/All-cards-fr.docx
+++ b/pictures/Deck-fr/All-cards-fr.docx
@@ -17,15 +17,15 @@
         </w:tblBorders>
         <w:tblCellMar>
           <w:top w:w="85" w:type="dxa"/>
-          <w:left w:w="85" w:type="dxa"/>
+          <w:left w:w="70" w:type="dxa"/>
           <w:bottom w:w="85" w:type="dxa"/>
-          <w:right w:w="85" w:type="dxa"/>
+          <w:right w:w="70" w:type="dxa"/>
         </w:tblCellMar>
         <w:tblLook w:val="04A0" w:firstRow="1" w:lastRow="0" w:firstColumn="1" w:lastColumn="0" w:noHBand="0" w:noVBand="1"/>
       </w:tblPr>
       <w:tblGrid>
-        <w:gridCol w:w="2755"/>
-        <w:gridCol w:w="2755"/>
+        <w:gridCol w:w="2740"/>
+        <w:gridCol w:w="2740"/>
         <w:gridCol w:w="2540"/>
         <w:gridCol w:w="2540"/>
       </w:tblGrid>
@@ -35,7 +35,7 @@
         </w:trPr>
         <w:tc>
           <w:tcPr>
-            <w:tcW w:w="0" w:type="auto"/>
+            <w:tcW w:w="5080" w:type="dxa"/>
             <w:gridSpan w:val="2"/>
             <w:vAlign w:val="center"/>
           </w:tcPr>
@@ -48,10 +48,16 @@
                 <w:noProof/>
               </w:rPr>
               <w:drawing>
-                <wp:inline distT="0" distB="0" distL="0" distR="0" wp14:anchorId="0E7D2F7F" wp14:editId="7393CFBC">
-                  <wp:extent cx="3387600" cy="2340000"/>
-                  <wp:effectExtent l="0" t="0" r="3810" b="3175"/>
-                  <wp:docPr id="528447404" name="Image 1"/>
+                <wp:inline distT="0" distB="0" distL="0" distR="0" wp14:anchorId="74EBBFBC" wp14:editId="0D13CBDD">
+                  <wp:extent cx="3389253" cy="2340000"/>
+                  <wp:effectExtent l="0" t="0" r="1905" b="3175"/>
+                  <wp:docPr id="2" name="Image 1">
+                    <a:extLst xmlns:a="http://schemas.openxmlformats.org/drawingml/2006/main">
+                      <a:ext uri="{FF2B5EF4-FFF2-40B4-BE49-F238E27FC236}">
+                        <a16:creationId xmlns:a16="http://schemas.microsoft.com/office/drawing/2014/main" id="{FE0E0D7B-6DA3-CB45-17DD-366D0E4DD07E}"/>
+                      </a:ext>
+                    </a:extLst>
+                  </wp:docPr>
                   <wp:cNvGraphicFramePr>
                     <a:graphicFrameLocks xmlns:a="http://schemas.openxmlformats.org/drawingml/2006/main" noChangeAspect="1"/>
                   </wp:cNvGraphicFramePr>
@@ -59,7 +65,13 @@
                     <a:graphicData uri="http://schemas.openxmlformats.org/drawingml/2006/picture">
                       <pic:pic xmlns:pic="http://schemas.openxmlformats.org/drawingml/2006/picture">
                         <pic:nvPicPr>
-                          <pic:cNvPr id="0" name="Picture 1"/>
+                          <pic:cNvPr id="2" name="Image 1">
+                            <a:extLst>
+                              <a:ext uri="{FF2B5EF4-FFF2-40B4-BE49-F238E27FC236}">
+                                <a16:creationId xmlns:a16="http://schemas.microsoft.com/office/drawing/2014/main" id="{FE0E0D7B-6DA3-CB45-17DD-366D0E4DD07E}"/>
+                              </a:ext>
+                            </a:extLst>
+                          </pic:cNvPr>
                           <pic:cNvPicPr>
                             <a:picLocks noChangeAspect="1" noChangeArrowheads="1"/>
                           </pic:cNvPicPr>
@@ -80,15 +92,12 @@
                         <pic:spPr bwMode="auto">
                           <a:xfrm>
                             <a:off x="0" y="0"/>
-                            <a:ext cx="3387600" cy="2340000"/>
+                            <a:ext cx="3389253" cy="2340000"/>
                           </a:xfrm>
                           <a:prstGeom prst="rect">
                             <a:avLst/>
                           </a:prstGeom>
                           <a:noFill/>
-                          <a:ln>
-                            <a:noFill/>
-                          </a:ln>
                         </pic:spPr>
                       </pic:pic>
                     </a:graphicData>
@@ -100,7 +109,7 @@
         </w:tc>
         <w:tc>
           <w:tcPr>
-            <w:tcW w:w="0" w:type="auto"/>
+            <w:tcW w:w="2540" w:type="dxa"/>
             <w:vAlign w:val="center"/>
           </w:tcPr>
           <w:p>
@@ -164,7 +173,7 @@
         </w:tc>
         <w:tc>
           <w:tcPr>
-            <w:tcW w:w="0" w:type="auto"/>
+            <w:tcW w:w="2540" w:type="dxa"/>
             <w:vAlign w:val="center"/>
           </w:tcPr>
           <w:p>
@@ -228,6 +237,12 @@
         </w:tc>
       </w:tr>
       <w:tr>
+        <w:tblPrEx>
+          <w:tblCellMar>
+            <w:left w:w="85" w:type="dxa"/>
+            <w:right w:w="85" w:type="dxa"/>
+          </w:tblCellMar>
+        </w:tblPrEx>
         <w:trPr>
           <w:jc w:val="center"/>
         </w:trPr>
@@ -489,6 +504,12 @@
         </w:tc>
       </w:tr>
       <w:tr>
+        <w:tblPrEx>
+          <w:tblCellMar>
+            <w:left w:w="85" w:type="dxa"/>
+            <w:right w:w="85" w:type="dxa"/>
+          </w:tblCellMar>
+        </w:tblPrEx>
         <w:trPr>
           <w:jc w:val="center"/>
         </w:trPr>
@@ -750,6 +771,12 @@
         </w:tc>
       </w:tr>
       <w:tr>
+        <w:tblPrEx>
+          <w:tblCellMar>
+            <w:left w:w="85" w:type="dxa"/>
+            <w:right w:w="85" w:type="dxa"/>
+          </w:tblCellMar>
+        </w:tblPrEx>
         <w:trPr>
           <w:jc w:val="center"/>
         </w:trPr>
@@ -958,6 +985,12 @@
         </w:tc>
       </w:tr>
       <w:tr>
+        <w:tblPrEx>
+          <w:tblCellMar>
+            <w:left w:w="85" w:type="dxa"/>
+            <w:right w:w="85" w:type="dxa"/>
+          </w:tblCellMar>
+        </w:tblPrEx>
         <w:trPr>
           <w:jc w:val="center"/>
         </w:trPr>

</xml_diff>